<commit_message>
Plan Taquería F2: revisión adversarial (0 B · 5 M · 10 m; mayores arreglados, cifras sin mover) + mismos arreglos en la FAQ de la landing
Via: Claude Code
Co-Authored-By: Claude Opus 5.5 <noreply@anthropic.com>
</commit_message>
<xml_diff>
--- a/astro-site/public/dl/plan-negocio-taqueria/plan-de-negocio-taqueria.docx
+++ b/astro-site/public/dl/plan-negocio-taqueria/plan-de-negocio-taqueria.docx
@@ -330,7 +330,7 @@
     </w:p>
     <w:p>
       <w:r>
-        <w:t>El primer año factura 358.050 € y deja un resultado neto de 32.563 €, un 9,1 % de las ventas. Los comensales crecen un 6 % en el segundo año y un 4 % en el tercero, con el mismo ticket: las ventas pasan a 379.533 € y 394.714 €, y el neto, a 39.022 € y 37.900 €. La holgura de caja sobre el equilibrio es de 26,3 % el primer año, pero porque hay carencia. En el segundo baja a 18,7 %, porque empieza a devolverse el principal, y en el tercero es de 19,9 %. Son los años que hay que vigilar. El payback antes de la deuda, en años, sale en la Tesorería del Excel: «2,9» con el fondo de maniobra dentro y «2,0» sin él.</w:t>
+        <w:t>A partir de ahí, los comensales crecen un 6 % en el segundo año y un 4 % en el tercero, con el mismo ticket: las ventas pasan a 379.533 € y 394.714 €, y el neto, a 39.022 € y 37.900 €. La holgura de caja sobre el equilibrio es de 26,3 % el primer año, pero porque hay carencia. En el segundo baja a 18,7 %, porque empieza a devolverse el principal, y en el tercero es de 19,9 %. Son los años que hay que vigilar. El payback antes de la deuda, en años, sale en la Tesorería del Excel: «2,9» con el fondo de maniobra dentro y «2,0» sin él.</w:t>
       </w:r>
     </w:p>
     <w:p>
@@ -362,7 +362,7 @@
     </w:p>
     <w:p>
       <w:r>
-        <w:t>La propuesta de valor es el pastor del trompo a la vista, con tortilla de maíz nixtamalizado (el maíz cocido con cal) y una carta corta de 8 a 10 tacos. Se pide por orden, que es la porción de 3 a 5 tacos del mismo guiso y que en España llamaríamos ración. Junto al pastor hay carnitas, el cerdo confitado, y guisados del día, las cazuelas de relleno. Hay gringa, que es tortilla de harina con pastor y queso, y algún campechano, la mezcla de dos carnes, o un suadero, un corte de res entre el vientre y la pierna que se confita. Pedir «con todo» quiere decir con cebolla y cilantro. La barra de salsas funciona con reglas, las aguas frescas son de la casa y la orden «para armar», con la tortilla y el relleno aparte, es la forma de llevarte el taco a casa sin que llegue blando.</w:t>
+        <w:t>La propuesta de valor es el pastor del trompo a la vista, con tortilla de maíz nixtamalizado (el maíz cocido con cal) y una carta corta de 8 a 10 tacos. Se pide por orden, que es la porción de 3 a 5 tacos del mismo guiso y que en España llamaríamos ración. Junto al pastor hay carnitas, el cerdo confitado, y guisados del día, las cazuelas de relleno. Hay gringa, que es tortilla de harina con pastor y queso, y algún campechano, la mezcla de dos carnes, o un suadero, un corte de res entre el vientre y la pierna que se confita. Pedir «con todo» quiere decir con cebolla y cilantro. La barra de salsas funciona con reglas, las aguas frescas (agua con fruta o con flor de jamaica, endulzada) son de la casa y la orden «para armar», con la tortilla y el relleno aparte, es la forma de llevarte el taco a casa sin que llegue blando.</w:t>
       </w:r>
     </w:p>
     <w:p>
@@ -414,7 +414,7 @@
     </w:p>
     <w:p>
       <w:r>
-        <w:t>Con el Mes 1 en enero y en el orden del calendario, el plan reparte la venta con la estacionalidad. Enero y agosto son los meses más flojos, un 7 % del año cada uno; diciembre es el pico, con un 9,6 %; septiembre, con la Independencia de México el 15 y el 16, y noviembre, con el Día de Muertos el 1 y el 2, salen algo más fuertes, y la terraza suma de abril a octubre. Entre el mejor mes y el peor hay un 37 % de diferencia: una taquería de barrio es un negocio bastante plano. El Mes 1 en enero tiene su consecuencia: la rampa del arranque cae sobre enero y febrero, los meses más flojos, y por eso el fondo de maniobra cuenta. Si abres en otro mes, gira la fila de estacionalidad.</w:t>
+        <w:t>Con el Mes 1 en enero y en el orden del calendario, el plan reparte la venta con la estacionalidad. Enero y agosto son los meses más flojos, un 7 % del año cada uno; diciembre es el pico, con un 9,6 %; septiembre, con la Independencia de México el 15 y el 16, y noviembre, con el Día de Muertos el 1 y el 2, salen algo más fuertes, y la terraza suma de abril a octubre. Entre el mejor mes y el peor hay un 37 % de diferencia: una taquería de ciudad es un negocio bastante plano. El Mes 1 en enero tiene su consecuencia: la rampa del arranque cae sobre enero y febrero, los meses más flojos, y por eso el fondo de maniobra cuenta. Si abres en otro mes, gira la fila de estacionalidad.</w:t>
       </w:r>
     </w:p>
     <w:p>
@@ -545,22 +545,22 @@
     </w:p>
     <w:p>
       <w:r>
-        <w:t>El trompo manda en esta taquería, y su rendimiento se calcula, no se supone. El trompo es el asador vertical donde gira la carne del pastor, el cerdo marinado en adobo de chiles y achiote que se asa con piña. La calculadora del kit parte de un cono de 15 kg de carne cruda, con un 8 % de adobo, un 35 % de merma de cocción y goteo y un 5 % de recortes. Con eso rinde un 64,8 % y da 278 tacos de 35 g servidos, unos 18,5 por kg crudo; un puesto de Ciudad de México sirve unos 25 por kg. Son estimaciones del kit, porque ninguna fuente publica la merma de cocción del pastor: mídela tú. Pesa el cono crudo y el sobrante al cierre con la hoja de rendimiento del Kit de Tareas Recurrentes: Taquería Mexicana y lleva la media a la calculadora. Mide en el kit, recalcula en el plan. El taco al pastor de la carta cuesta 0,61 € con merma, un 22,5 % de food cost sobre 3,00 € con IVA. Las carnitas (cerdo confitado), el suadero (corte de res entre el vientre y la pierna, también confitado) y la barbacoa rinden menos, por el confitado y la cocción larga.</w:t>
+        <w:t>El trompo manda en esta taquería, y su rendimiento se calcula, no se supone. La calculadora del kit parte de un cono de 15 kg de carne cruda, con un 8 % de adobo, un 35 % de merma de cocción y goteo y un 5 % de recortes. Con eso rinde un 64,8 % y da 278 tacos de 35 g servidos, unos 18,5 por kg crudo; un puesto de Ciudad de México sirve unos 25 por kg. Son estimaciones del kit, porque ninguna fuente publica la merma de cocción del pastor: mídela tú. Pesa el cono crudo y el sobrante al cierre con la hoja de rendimiento del Kit de Tareas Recurrentes: Taquería Mexicana y lleva la media a la calculadora. Mide en el kit, recalcula en el plan. El taco al pastor de la carta cuesta 0,61 € con merma, un 22,5 % de food cost sobre su precio sin IVA (en carta, 3,00 € con IVA). Las carnitas, el suadero y la barbacoa rinden menos, por el confitado y la cocción larga.</w:t>
       </w:r>
     </w:p>
     <w:p>
       <w:r>
-        <w:t>El equipo se compra con precio y fuente, no a ojo. El trompo de gas del caso cuesta 1.800 €; en catálogo hay modelos de 1.279 a 1.784 € sin IVA. La plancha y el comal, la superficie de barro o acero donde se calienta la tortilla, suman 3.000 €. La freidora, el fogón de carnitas, el baño maría y el mantenedor de tortillas, 3.700 €. La campana extractora cuesta 1.500 €; el frío, con la mesa refrigerada de salsas, 4.500 €; y el conducto exclusivo a cubierta, 6.000 €. El trompo de gas cabe en una salida de humos normal, con instalación por empresa habilitada y revisión cada 5 años. El de carbón, igual que la parrilla de carne asada, pide además filtro de partículas en el conducto: es una variante sin Excel, con más inversión y con una ordenanza que la admita. Si te tienta por el sabor, compara las dos cuentas con presupuestos reales antes de firmar el local.</w:t>
+        <w:t>El equipo se compra con precio y fuente, no a ojo. El trompo de gas del caso cuesta 1.800 €; en catálogo hay modelos de 1.279 a 1.784 € sin IVA. La plancha y el comal suman 3.000 €. La freidora, el fogón de carnitas, el baño maría y el mantenedor de tortillas, 3.700 €. La campana extractora cuesta 1.500 €; el frío, con la mesa refrigerada de salsas, 4.500 €; y el conducto exclusivo a cubierta, 6.000 €. El trompo de gas cabe en una salida de humos normal, con instalación por empresa habilitada y revisión cada 5 años. El de carbón, igual que la parrilla de carne asada, pide además filtro de partículas en el conducto: es una variante sin Excel, con más inversión y con una ordenanza que la admita. Si te tienta por el sabor, compara las dos cuentas con presupuestos reales antes de firmar el local.</w:t>
       </w:r>
     </w:p>
     <w:p>
       <w:r>
-        <w:t>Dimensiona la producción por el sábado, no por la media. El caso despacha unos 255 tacos al día más unas 25 gringas y quesadillas (la gringa es una tortilla de harina con pastor y queso), y necesita unas 280 tortillas diarias. El pastor es un 45 % de los tacos, unos 115 al día, que son unos 6,2 kg de carne cruda diarios y 10-11 kg el sábado. Un asador de cuatro quemadores y 35 kg cubre el pico con un cono de 15-20 kg, así que el trompo rara vez es el límite. Pide presupuesto con instalación y plazo de entrega, porque el precio cambia según la marca, y piensa en el relevo: que el segundo taquero sepa montar y cortar el cono evita que todo dependa de una sola persona.</w:t>
+        <w:t>Dimensiona la producción por el sábado, no por la media. El caso despacha unos 255 tacos al día más unas 25 gringas y quesadillas, y necesita unas 280 tortillas diarias. El pastor es un 45 % de los tacos, unos 115 al día, que son unos 6,2 kg de carne cruda diarios y 10-11 kg el sábado. Un asador de cuatro quemadores y 35 kg cubre el pico con un cono de 15-20 kg, así que el trompo rara vez es el límite. Pide presupuesto con instalación y plazo de entrega, porque el precio cambia según la marca, y piensa en el relevo: que el segundo taquero sepa montar y cortar el cono evita que todo dependa de una sola persona.</w:t>
       </w:r>
     </w:p>
     <w:p>
       <w:r>
-        <w:t>Hay una alternativa razonada, sin Excel: hacer tú la tortilla con nixtamal propio, es decir, maíz cocido con cal. El caso compra unas 280 tortillas al día, unas 84.000 al año, que cuestan unos 12.000 €. Hacerlas ahorra unos 0,10 € por tortilla, pero pide un tortillero de 0,75 jornada (unos 18.900 € al año) y entre 15.000 y 25.000 € de molino, cocedor y tortilladora; una tortilladora automática cuesta 7.808 $ en Estados Unidos y en España no hay precio publicado. El equilibrio sale en unas 697 tortillas al día, muy por encima de las del caso. Por eso el nixtamal es una decisión de producto, no de ahorro. La taquería-mezcalería con tortillería propia es otro negocio, el de la Guía Restaurante Mexicano.</w:t>
+        <w:t>Hay una alternativa que el plan financiero no modela, pero la hoja «Tortilla» de la calculadora sí: hacer tú la tortilla con nixtamal propio, es decir, maíz cocido con cal. El caso compra unas 280 tortillas al día, unas 84.000 al año, que cuestan unos 12.000 €. Hacerlas ahorra unos 0,10 € por tortilla, pero pide un tortillero de 0,75 jornada (unos 18.900 € al año) y entre 15.000 y 25.000 € de molino, cocedor y tortilladora; una tortilladora automática cuesta 7.808 $ en Estados Unidos y en España no hay precio publicado. El equilibrio sale en unas 697 tortillas al día, muy por encima de las del caso. Por eso el nixtamal es una decisión de producto, no de ahorro. La taquería-mezcalería con tortillería propia es otro negocio, el de la Guía Restaurante Mexicano.</w:t>
       </w:r>
     </w:p>
     <w:p>
@@ -607,7 +607,7 @@
     </w:p>
     <w:p>
       <w:r>
-        <w:t>Si algún día quieres un repartidor propio, tiene que ir con contrato laboral del convenio de hostelería. En el reparto que organiza una plataforma por algoritmo, la ley presume la relación laboral (disposición adicional 23.ª del Estatuto), y es la plataforma quien la asume. Por eso el caso vende por plataforma, con techo y sin reparto propio. Haz la cuenta: un repartidor de viernes a domingo (0,35 jornada) cuesta unos 8.800 € al año; con moto, seguro y gasolina (unos 2.500 €) son unos 11.300 €, un 26 % de las ventas por plataforma. Se queda cerca de la comisión que cobra la plataforma (30 %), pero con el riesgo laboral a tu cargo y sin su escaparate. Antes de montarlo, calcula con tus pedidos reales.</w:t>
+        <w:t>Si algún día quieres un repartidor propio, tiene que ir con contrato laboral del convenio de hostelería. En el reparto que organiza una plataforma por algoritmo, la ley presume la relación laboral (disposición adicional 23.ª del Estatuto), y es la plataforma quien la asume. Por eso el caso vende por plataforma, con techo y sin reparto propio. La cuenta del plan de marketing lo deja claro: un repartidor de fin de semana, con moto, seguro y gasolina, se come casi lo mismo que la comisión (30 %), pero con el riesgo laboral a tu cargo y sin el escaparate de la plataforma. Antes de montarlo, calcula con tus pedidos reales.</w:t>
       </w:r>
     </w:p>
     <w:p>
@@ -639,7 +639,7 @@
     </w:p>
     <w:p>
       <w:r>
-        <w:t>La cuenta de resultados a tres años proyecta unas ventas de 358.050 €, 379.533 € y 394.714 €. El margen bruto del primer año es del 63,3 %, después de todos los costes variables: mercancía (el 26,8 % de las ventas), envases, plataforma, medios de pago y varios. El personal suma 129.521 €, el alquiler 17.400 € (un 4,9 % de las ventas) y la tasa de terraza y residuos 1.700 €, que es orientativa: pon la de tu ayuntamiento. El resultado de explotación antes de amortizaciones e intereses es de 54.325 €, un 15,2 %. El neto es de 32.563 €, 39.022 € y 37.900 €, un 9,1 %, un 10,3 % y un 9,6 %; el tercer año ya tributa al tipo general del Impuesto de Sociedades. Con honestidad: el food cost de la comida es del 27,0 %, la media de toda la carta con su merma, no el del taco al pastor, y queda por debajo del 28-33 % de nuestra Guía Restaurante Mexicano. El plan estima la carne del pastor a 5,50 € el kilo y la tortilla de maíz a 0,14 €. En Makro, la paleta de cerdo sin hueso de gama selecta estaba a 6,99 € con IVA en octubre de 2026 y la tortilla, a unos 0,11-0,12 €: pon los precios de tu proveedor. Cada punto de food cost de la comida mueve unos 2.900 € al año, y con la comida al 30 % el neto del año 2 baja a un 8 % (cálculo del kit con este mismo Excel).</w:t>
+        <w:t>La cuenta de resultados a tres años proyecta unas ventas de 358.050 €, 379.533 € y 394.714 €. El margen bruto del primer año es del 63,3 %, después de todos los costes variables: mercancía (el 26,8 % de las ventas), envases, plataforma, medios de pago y varios. El personal suma 129.521 €, el alquiler 17.400 € (un 4,9 % de las ventas) y la tasa de terraza y residuos 1.700 €, que es orientativa: pon la de tu ayuntamiento. El resultado de explotación antes de amortizaciones e intereses es de 54.325 €, un 15,2 %. El neto es de 32.563 €, 39.022 € y 37.900 €, un 9,1 %, un 10,3 % y un 9,6 %; el tercer año ya tributa al tipo general del Impuesto de Sociedades (25 %); si tu cifra de negocios no llega a 1 M €, el tuyo será más bajo: confírmalo con tu asesor. Con honestidad: el food cost de la comida es del 27,0 %, la media de toda la carta con su merma, no el del taco al pastor, y queda por debajo del 28-33 % de nuestra Guía Restaurante Mexicano. El plan estima la carne del pastor a 5,50 € el kilo y la tortilla de maíz a 0,14 €. En Makro, la paleta de cerdo Duroc sin hueso estaba a 6,99 € el kilo con IVA en octubre de 2026 y la tortilla, a unos 0,11-0,12 €: pon los precios de tu proveedor. Cada punto de food cost de la comida mueve unos 2.900 € al año, y con la comida al 30 % el neto del año 2 baja a un 8 % (cálculo del kit con este mismo Excel).</w:t>
       </w:r>
     </w:p>
     <w:p>
@@ -696,12 +696,12 @@
     </w:p>
     <w:p>
       <w:r>
-        <w:t>El gas del trompo, la plancha y el comal lo instala una empresa habilitada, con puesta en marcha certificada e inspección o revisión cada 5 años (RD 919/2006). En sanidad presentas una declaración responsable ante el registro sanitario de tu comunidad (RD 1021/2022); el RGSEAA solo aplica si suministras a otros negocios por encima de lo que permite su art. 3, por ejemplo si vendes tortilla a otras taquerías. Tu APPCC se apoya en la flexibilidad del art. 20 del RD 1021/2022. El trompo no tiene norma propia: las guías piden sonda al inicio y a mitad del servicio, y la hora límite del cono la fija tu APPCC.</w:t>
+        <w:t>El gas del trompo, la plancha y el comal lo instala una empresa habilitada, con puesta en marcha certificada e inspección o revisión cada 5 años (RD 919/2006). En sanidad presentas una declaración responsable ante el registro sanitario de tu comunidad (RD 1021/2022); el RGSEAA solo aplica si suministras a otros negocios por encima de lo que permite el art. 3 del RD 1021/2022, por ejemplo si vendes tortilla a otras taquerías. Tu APPCC se apoya en la flexibilidad del art. 20 del RD 1021/2022. El trompo no tiene norma propia: las guías piden sonda al inicio y a mitad del servicio, y la hora límite del cono la fija tu APPCC.</w:t>
       </w:r>
     </w:p>
     <w:p>
       <w:r>
-        <w:t>Lo que se sirve sin envasar informa de los 14 alérgenos (RD 126/2015), por escrito o de palabra si queda registrado en el establecimiento, y en la venta a distancia, antes de comprar (Reglamento (UE) 1169/2011, art. 14). En la taquería tocan la salsa macha (cacahuete o sésamo), la tortilla de harina de la gringa y la cerveza (gluten) y los quesos y la crema (leche). «Sin gluten» solo con 20 mg/kg o menos (Reglamento de Ejecución (UE) 828/2014): con comal, freidora o pinzas compartidos con la tortilla de harina, no lo prometas. Según el art. 8 de la Ley 1/2025, el cliente puede llevarse lo que no consuma sin coste, salvo el envase de plástico de un solo uso, y debes avisarlo de forma visible, mejor en la carta. El art. 55 de la Ley 7/2022 pide cobrar aparte ese envase en el tique; las bandejas de cartón no son plástico y las de aluminio, consúltalo con tu proveedor.</w:t>
+        <w:t>Lo que se sirve sin envasar informa de los 14 alérgenos (RD 126/2015), por escrito o de palabra si queda registrado en el establecimiento, y en la venta a distancia, antes de comprar (Reglamento (UE) 1169/2011, art. 14). En la taquería tocan la salsa macha (aceite con chiles secos y semillas: cacahuete o sésamo), la tortilla de harina de la gringa y la cerveza (gluten) y los quesos y la crema (leche). «Sin gluten» solo con 20 mg/kg o menos (Reglamento de Ejecución (UE) 828/2014): con comal, freidora o pinzas compartidos con la tortilla de harina, no lo prometas. Según el art. 8 de la Ley 1/2025, el cliente puede llevarse lo que no consuma sin coste, salvo el envase de plástico de un solo uso, y debes avisarlo de forma visible, mejor en la carta. El art. 55 de la Ley 7/2022 pide cobrar aparte ese envase en el tique; las bandejas de cartón sin recubrimiento de plástico no lo son y, las de aluminio, consúltalo con tu proveedor.</w:t>
       </w:r>
     </w:p>
     <w:p>
@@ -716,7 +716,7 @@
     </w:p>
     <w:p>
       <w:r>
-        <w:t>En el IVA (Ley 37/1992, art. 91), en sala todo va al 10 %. Para llevar y a domicilio, la comida va al 10 %, pero las aguas frescas azucaradas, la cerveza y el mezcal que salen del local van al 21 %. En las compras, los quesos y las frutas, verduras y hortalizas naturales (aguacate, tomate, cebolla, cilantro, lima, piña) van al 4 %. El alcohol para llevar tiene los horarios de tu comunidad autónoma y nunca a menores. En personal aplican el convenio de hostelería, el SMI de 2026 y el Estatuto de los Trabajadores. Factura con software Veri*factu: consulta con tu gestoría la fecha que te aplica. El marco es el español: en México y el resto de Latinoamérica los trámites son otros. Lo demás, compruébalo con tu gestoría, tu ayuntamiento o el inspector.</w:t>
+        <w:t>En el IVA (Ley 37/1992, art. 91), en sala todo va al 10 %. Para llevar y a domicilio, la comida va al 10 %, pero el alcohol (cerveza, mezcal, tequila) y las aguas frescas y los refrescos con azúcares o edulcorantes añadidos que salen del local van al 21 %. En las compras, los quesos y las frutas, verduras y hortalizas naturales (aguacate, tomate, cebolla, cilantro, lima, piña) van al 4 %. El alcohol para llevar tiene los horarios de tu comunidad autónoma y nunca a menores. En personal aplican el convenio de hostelería, el SMI de 2026 y el Estatuto de los Trabajadores. Factura con software Veri*factu: consulta con tu gestoría la fecha que te aplica. El marco es el español: en México y el resto de Latinoamérica los trámites son otros. Lo demás, compruébalo con tu gestoría, tu ayuntamiento o el inspector.</w:t>
       </w:r>
     </w:p>
     <w:p>

</xml_diff>